<commit_message>
PDF poročilo in majhna sprememba
</commit_message>
<xml_diff>
--- a/porocilo/Porocilo_Nurikabe.docx
+++ b/porocilo/Porocilo_Nurikabe.docx
@@ -78,7 +78,7 @@
         <w:jc w:val="center"/>
       </w:pPr>
       <w:r>
-        <w:t>Junij</w:t>
+        <w:t>Julij</w:t>
       </w:r>
       <w:r>
         <w:t xml:space="preserve"> 2026</w:t>
@@ -137,13 +137,13 @@
           <w:r>
             <w:fldChar w:fldCharType="separate"/>
           </w:r>
-          <w:hyperlink w:anchor="_Toc234349593" w:history="1">
+          <w:hyperlink w:anchor="_Toc234433647" w:history="1">
             <w:r>
               <w:rPr>
                 <w:rStyle w:val="Hiperpovezava"/>
                 <w:noProof/>
               </w:rPr>
-              <w:t>1 Uvod</w:t>
+              <w:t>1 UVOD</w:t>
             </w:r>
             <w:r>
               <w:rPr>
@@ -161,7 +161,7 @@
               <w:rPr>
                 <w:noProof/>
               </w:rPr>
-              <w:instrText xml:space="preserve"> PAGEREF _Toc234349593 \h </w:instrText>
+              <w:instrText xml:space="preserve"> PAGEREF _Toc234433647 \h </w:instrText>
             </w:r>
             <w:r>
               <w:rPr>
@@ -201,13 +201,13 @@
               <w14:ligatures w14:val="standardContextual"/>
             </w:rPr>
           </w:pPr>
-          <w:hyperlink w:anchor="_Toc234349594" w:history="1">
+          <w:hyperlink w:anchor="_Toc234433648" w:history="1">
             <w:r>
               <w:rPr>
                 <w:rStyle w:val="Hiperpovezava"/>
                 <w:noProof/>
               </w:rPr>
-              <w:t>2 Namestitev in zagon</w:t>
+              <w:t>2 NAMESTITEV IN ZAGON</w:t>
             </w:r>
             <w:r>
               <w:rPr>
@@ -225,7 +225,7 @@
               <w:rPr>
                 <w:noProof/>
               </w:rPr>
-              <w:instrText xml:space="preserve"> PAGEREF _Toc234349594 \h </w:instrText>
+              <w:instrText xml:space="preserve"> PAGEREF _Toc234433648 \h </w:instrText>
             </w:r>
             <w:r>
               <w:rPr>
@@ -265,13 +265,13 @@
               <w14:ligatures w14:val="standardContextual"/>
             </w:rPr>
           </w:pPr>
-          <w:hyperlink w:anchor="_Toc234349595" w:history="1">
+          <w:hyperlink w:anchor="_Toc234433649" w:history="1">
             <w:r>
               <w:rPr>
                 <w:rStyle w:val="Hiperpovezava"/>
                 <w:noProof/>
               </w:rPr>
-              <w:t>3 Zasnova programa</w:t>
+              <w:t>3 ZASNOVA PROGRAMA</w:t>
             </w:r>
             <w:r>
               <w:rPr>
@@ -289,7 +289,7 @@
               <w:rPr>
                 <w:noProof/>
               </w:rPr>
-              <w:instrText xml:space="preserve"> PAGEREF _Toc234349595 \h </w:instrText>
+              <w:instrText xml:space="preserve"> PAGEREF _Toc234433649 \h </w:instrText>
             </w:r>
             <w:r>
               <w:rPr>
@@ -329,7 +329,7 @@
               <w14:ligatures w14:val="standardContextual"/>
             </w:rPr>
           </w:pPr>
-          <w:hyperlink w:anchor="_Toc234349596" w:history="1">
+          <w:hyperlink w:anchor="_Toc234433650" w:history="1">
             <w:r>
               <w:rPr>
                 <w:rStyle w:val="Hiperpovezava"/>
@@ -353,7 +353,7 @@
               <w:rPr>
                 <w:noProof/>
               </w:rPr>
-              <w:instrText xml:space="preserve"> PAGEREF _Toc234349596 \h </w:instrText>
+              <w:instrText xml:space="preserve"> PAGEREF _Toc234433650 \h </w:instrText>
             </w:r>
             <w:r>
               <w:rPr>
@@ -393,7 +393,7 @@
               <w14:ligatures w14:val="standardContextual"/>
             </w:rPr>
           </w:pPr>
-          <w:hyperlink w:anchor="_Toc234349597" w:history="1">
+          <w:hyperlink w:anchor="_Toc234433651" w:history="1">
             <w:r>
               <w:rPr>
                 <w:rStyle w:val="Hiperpovezava"/>
@@ -417,7 +417,7 @@
               <w:rPr>
                 <w:noProof/>
               </w:rPr>
-              <w:instrText xml:space="preserve"> PAGEREF _Toc234349597 \h </w:instrText>
+              <w:instrText xml:space="preserve"> PAGEREF _Toc234433651 \h </w:instrText>
             </w:r>
             <w:r>
               <w:rPr>
@@ -457,7 +457,7 @@
               <w14:ligatures w14:val="standardContextual"/>
             </w:rPr>
           </w:pPr>
-          <w:hyperlink w:anchor="_Toc234349598" w:history="1">
+          <w:hyperlink w:anchor="_Toc234433652" w:history="1">
             <w:r>
               <w:rPr>
                 <w:rStyle w:val="Hiperpovezava"/>
@@ -481,7 +481,7 @@
               <w:rPr>
                 <w:noProof/>
               </w:rPr>
-              <w:instrText xml:space="preserve"> PAGEREF _Toc234349598 \h </w:instrText>
+              <w:instrText xml:space="preserve"> PAGEREF _Toc234433652 \h </w:instrText>
             </w:r>
             <w:r>
               <w:rPr>
@@ -521,7 +521,7 @@
               <w14:ligatures w14:val="standardContextual"/>
             </w:rPr>
           </w:pPr>
-          <w:hyperlink w:anchor="_Toc234349599" w:history="1">
+          <w:hyperlink w:anchor="_Toc234433653" w:history="1">
             <w:r>
               <w:rPr>
                 <w:rStyle w:val="Hiperpovezava"/>
@@ -545,7 +545,7 @@
               <w:rPr>
                 <w:noProof/>
               </w:rPr>
-              <w:instrText xml:space="preserve"> PAGEREF _Toc234349599 \h </w:instrText>
+              <w:instrText xml:space="preserve"> PAGEREF _Toc234433653 \h </w:instrText>
             </w:r>
             <w:r>
               <w:rPr>
@@ -585,7 +585,7 @@
               <w14:ligatures w14:val="standardContextual"/>
             </w:rPr>
           </w:pPr>
-          <w:hyperlink w:anchor="_Toc234349600" w:history="1">
+          <w:hyperlink w:anchor="_Toc234433654" w:history="1">
             <w:r>
               <w:rPr>
                 <w:rStyle w:val="Hiperpovezava"/>
@@ -609,7 +609,7 @@
               <w:rPr>
                 <w:noProof/>
               </w:rPr>
-              <w:instrText xml:space="preserve"> PAGEREF _Toc234349600 \h </w:instrText>
+              <w:instrText xml:space="preserve"> PAGEREF _Toc234433654 \h </w:instrText>
             </w:r>
             <w:r>
               <w:rPr>
@@ -649,13 +649,13 @@
               <w14:ligatures w14:val="standardContextual"/>
             </w:rPr>
           </w:pPr>
-          <w:hyperlink w:anchor="_Toc234349601" w:history="1">
+          <w:hyperlink w:anchor="_Toc234433655" w:history="1">
             <w:r>
               <w:rPr>
                 <w:rStyle w:val="Hiperpovezava"/>
                 <w:noProof/>
               </w:rPr>
-              <w:t>4 Rezultati</w:t>
+              <w:t>4 REZULTATI</w:t>
             </w:r>
             <w:r>
               <w:rPr>
@@ -673,7 +673,7 @@
               <w:rPr>
                 <w:noProof/>
               </w:rPr>
-              <w:instrText xml:space="preserve"> PAGEREF _Toc234349601 \h </w:instrText>
+              <w:instrText xml:space="preserve"> PAGEREF _Toc234433655 \h </w:instrText>
             </w:r>
             <w:r>
               <w:rPr>
@@ -713,7 +713,7 @@
               <w14:ligatures w14:val="standardContextual"/>
             </w:rPr>
           </w:pPr>
-          <w:hyperlink w:anchor="_Toc234349602" w:history="1">
+          <w:hyperlink w:anchor="_Toc234433656" w:history="1">
             <w:r>
               <w:rPr>
                 <w:rStyle w:val="Hiperpovezava"/>
@@ -737,7 +737,7 @@
               <w:rPr>
                 <w:noProof/>
               </w:rPr>
-              <w:instrText xml:space="preserve"> PAGEREF _Toc234349602 \h </w:instrText>
+              <w:instrText xml:space="preserve"> PAGEREF _Toc234433656 \h </w:instrText>
             </w:r>
             <w:r>
               <w:rPr>
@@ -777,13 +777,13 @@
               <w14:ligatures w14:val="standardContextual"/>
             </w:rPr>
           </w:pPr>
-          <w:hyperlink w:anchor="_Toc234349603" w:history="1">
+          <w:hyperlink w:anchor="_Toc234433657" w:history="1">
             <w:r>
               <w:rPr>
                 <w:rStyle w:val="Hiperpovezava"/>
                 <w:noProof/>
               </w:rPr>
-              <w:t>5 Zaključek</w:t>
+              <w:t>5 ZAKLJUČEK</w:t>
             </w:r>
             <w:r>
               <w:rPr>
@@ -801,7 +801,7 @@
               <w:rPr>
                 <w:noProof/>
               </w:rPr>
-              <w:instrText xml:space="preserve"> PAGEREF _Toc234349603 \h </w:instrText>
+              <w:instrText xml:space="preserve"> PAGEREF _Toc234433657 \h </w:instrText>
             </w:r>
             <w:r>
               <w:rPr>
@@ -844,10 +844,13 @@
       <w:pPr>
         <w:pStyle w:val="Naslov1"/>
       </w:pPr>
-      <w:bookmarkStart w:id="0" w:name="_Toc234349593"/>
+      <w:bookmarkStart w:id="0" w:name="_Toc234433647"/>
       <w:r>
         <w:lastRenderedPageBreak/>
-        <w:t>1 Uvod</w:t>
+        <w:t xml:space="preserve">1 </w:t>
+      </w:r>
+      <w:r>
+        <w:t>UVOD</w:t>
       </w:r>
       <w:bookmarkEnd w:id="0"/>
     </w:p>
@@ -1024,10 +1027,13 @@
       <w:pPr>
         <w:pStyle w:val="Naslov1"/>
       </w:pPr>
-      <w:bookmarkStart w:id="1" w:name="_Toc234349594"/>
+      <w:bookmarkStart w:id="1" w:name="_Toc234433648"/>
       <w:r>
         <w:lastRenderedPageBreak/>
-        <w:t>2 Namestitev in zagon</w:t>
+        <w:t xml:space="preserve">2 </w:t>
+      </w:r>
+      <w:r>
+        <w:t>NAMESTITEV IN ZAGON</w:t>
       </w:r>
       <w:bookmarkEnd w:id="1"/>
     </w:p>
@@ -1045,7 +1051,22 @@
       </w:r>
       <w:proofErr w:type="spellEnd"/>
       <w:r>
-        <w:t xml:space="preserve"> različice 3.10 ali novejše. Grafični vmesnik uporablja knjižnico </w:t>
+        <w:t xml:space="preserve"> različice 3.10 ali novejše. </w:t>
+      </w:r>
+    </w:p>
+    <w:p>
+      <w:pPr>
+        <w:spacing w:after="120"/>
+        <w:jc w:val="both"/>
+      </w:pPr>
+    </w:p>
+    <w:p>
+      <w:pPr>
+        <w:spacing w:after="120"/>
+        <w:jc w:val="both"/>
+      </w:pPr>
+      <w:r>
+        <w:t xml:space="preserve">Grafični vmesnik uporablja knjižnico </w:t>
       </w:r>
       <w:proofErr w:type="spellStart"/>
       <w:r>
@@ -1076,7 +1097,7 @@
         <w:jc w:val="both"/>
       </w:pPr>
       <w:r>
-        <w:t>Aplikacijo zaženemo iz korenske mape projekta z ukazom:</w:t>
+        <w:t>Aplikacijo zaženemo z ukazom:</w:t>
       </w:r>
     </w:p>
     <w:p>
@@ -1125,6 +1146,13 @@
           <w:b/>
           <w:bCs/>
         </w:rPr>
+        <w:t>app/</w:t>
+      </w:r>
+      <w:r>
+        <w:rPr>
+          <w:b/>
+          <w:bCs/>
+        </w:rPr>
         <w:t>main.py</w:t>
       </w:r>
       <w:r>
@@ -1146,7 +1174,14 @@
           <w:b/>
           <w:bCs/>
         </w:rPr>
-        <w:t>app/logika.py</w:t>
+        <w:t>app/</w:t>
+      </w:r>
+      <w:r>
+        <w:rPr>
+          <w:b/>
+          <w:bCs/>
+        </w:rPr>
+        <w:t>logika.py</w:t>
       </w:r>
       <w:r>
         <w:t xml:space="preserve"> – podatkovni model uganke, branje in pisanje besedilnih datotek ter preverjanje pravil,</w:t>
@@ -1167,7 +1202,14 @@
           <w:b/>
           <w:bCs/>
         </w:rPr>
-        <w:t>app/resevalec.py</w:t>
+        <w:t>app/</w:t>
+      </w:r>
+      <w:r>
+        <w:rPr>
+          <w:b/>
+          <w:bCs/>
+        </w:rPr>
+        <w:t>resevalec.py</w:t>
       </w:r>
       <w:r>
         <w:t xml:space="preserve"> – samodejni reševalnik in funkcija za namige,</w:t>
@@ -1188,7 +1230,14 @@
           <w:b/>
           <w:bCs/>
         </w:rPr>
-        <w:t>app/vmesnik.py</w:t>
+        <w:t>app/</w:t>
+      </w:r>
+      <w:r>
+        <w:rPr>
+          <w:b/>
+          <w:bCs/>
+        </w:rPr>
+        <w:t>vmesnik.py</w:t>
       </w:r>
       <w:r>
         <w:t xml:space="preserve"> – grafični vmesnik </w:t>
@@ -1252,13 +1301,6 @@
       </w:r>
       <w:proofErr w:type="spellEnd"/>
       <w:r>
-        <w:rPr>
-          <w:b/>
-          <w:bCs/>
-        </w:rPr>
-        <w:t>/</w:t>
-      </w:r>
-      <w:r>
         <w:t xml:space="preserve"> – to poročilo in podatki testiranja (rezultati, rešitve, slike).</w:t>
       </w:r>
     </w:p>
@@ -1280,10 +1322,13 @@
       <w:pPr>
         <w:pStyle w:val="Naslov1"/>
       </w:pPr>
-      <w:bookmarkStart w:id="2" w:name="_Toc234349595"/>
+      <w:bookmarkStart w:id="2" w:name="_Toc234433649"/>
       <w:r>
         <w:lastRenderedPageBreak/>
-        <w:t>3 Zasnova programa</w:t>
+        <w:t xml:space="preserve">3 </w:t>
+      </w:r>
+      <w:r>
+        <w:t>ZASNOVA PROGRAMA</w:t>
       </w:r>
       <w:bookmarkEnd w:id="2"/>
     </w:p>
@@ -1291,7 +1336,7 @@
       <w:pPr>
         <w:pStyle w:val="Naslov2"/>
       </w:pPr>
-      <w:bookmarkStart w:id="3" w:name="_Toc234349596"/>
+      <w:bookmarkStart w:id="3" w:name="_Toc234433650"/>
       <w:r>
         <w:t>3.1 Format datotek</w:t>
       </w:r>
@@ -1473,7 +1518,7 @@
       <w:pPr>
         <w:pStyle w:val="Naslov2"/>
       </w:pPr>
-      <w:bookmarkStart w:id="4" w:name="_Toc234349597"/>
+      <w:bookmarkStart w:id="4" w:name="_Toc234433651"/>
       <w:r>
         <w:lastRenderedPageBreak/>
         <w:t>3.2 Algoritem reševanja</w:t>
@@ -1553,7 +1598,7 @@
       <w:pPr>
         <w:pStyle w:val="Naslov3"/>
       </w:pPr>
-      <w:bookmarkStart w:id="5" w:name="_Toc234349598"/>
+      <w:bookmarkStart w:id="5" w:name="_Toc234433652"/>
       <w:r>
         <w:t>3.2.1 Propagacija omejitev</w:t>
       </w:r>
@@ -1631,7 +1676,13 @@
       </w:r>
       <w:proofErr w:type="spellEnd"/>
       <w:r>
-        <w:t xml:space="preserve"> dosegljivost: vsak nedokončan otok ima proračun celic, za koliko se še sme razširiti; celica, ki je noben otok ne more doseči v okviru svojega proračuna (preverjeno z iskanjem v širino), je voda</w:t>
+        <w:t xml:space="preserve"> dosegljivost: vsak nedokončan otok ima proračun celic, za koliko se še sme razširiti</w:t>
+      </w:r>
+      <w:r>
+        <w:t>,</w:t>
+      </w:r>
+      <w:r>
+        <w:t xml:space="preserve"> celica, ki je noben otok ne more doseči v okviru svojega proračuna (preverjeno z iskanjem v širino), je voda</w:t>
       </w:r>
       <w:r>
         <w:t>,</w:t>
@@ -1708,7 +1759,7 @@
       <w:pPr>
         <w:pStyle w:val="Naslov3"/>
       </w:pPr>
-      <w:bookmarkStart w:id="6" w:name="_Toc234349599"/>
+      <w:bookmarkStart w:id="6" w:name="_Toc234433653"/>
       <w:r>
         <w:t>3.2.2 Sestopanje</w:t>
       </w:r>
@@ -1844,45 +1895,43 @@
       </w:r>
       <w:proofErr w:type="spellEnd"/>
       <w:r>
-        <w:t> v </w:t>
+        <w:t> v logika.py), da je zagotovo veljavna.</w:t>
+      </w:r>
+    </w:p>
+    <w:p>
+      <w:pPr>
+        <w:jc w:val="both"/>
+      </w:pPr>
+    </w:p>
+    <w:p>
+      <w:pPr>
+        <w:jc w:val="both"/>
+      </w:pPr>
+      <w:r>
+        <w:t>Zaradi teh izboljšav ostane ugibanja zelo malo, zato program reši tudi največje uganke (14x24)</w:t>
+      </w:r>
+      <w:r>
+        <w:t>.</w:t>
+      </w:r>
+    </w:p>
+    <w:p>
+      <w:pPr>
+        <w:jc w:val="both"/>
+      </w:pPr>
+    </w:p>
+    <w:p>
+      <w:pPr>
+        <w:jc w:val="both"/>
+      </w:pPr>
+      <w:r>
+        <w:t>Funkcija za namige (namig) uporabi isti reševalnik. Rešitev se interno shrani (</w:t>
       </w:r>
       <w:proofErr w:type="spellStart"/>
       <w:r>
-        <w:t>app</w:t>
-      </w:r>
-      <w:proofErr w:type="spellEnd"/>
-      <w:r>
-        <w:t>/logika.py), da je zagotovo veljavna.</w:t>
-      </w:r>
-    </w:p>
-    <w:p>
-      <w:pPr>
-        <w:jc w:val="both"/>
-      </w:pPr>
-    </w:p>
-    <w:p>
-      <w:pPr>
-        <w:jc w:val="both"/>
-      </w:pPr>
-      <w:r>
-        <w:t>Zaradi teh izboljšav ostane ugibanja zelo malo, zato program reši tudi največje uganke (14x24) v manj kot dveh sekundah.</w:t>
-      </w:r>
-    </w:p>
-    <w:p>
-      <w:pPr>
-        <w:jc w:val="both"/>
-      </w:pPr>
-    </w:p>
-    <w:p>
-      <w:pPr>
-        <w:jc w:val="both"/>
-      </w:pPr>
-      <w:r>
-        <w:t>Funkcija za namige (namig) uporabi isti reševalnik. Rešitev se interno shrani (</w:t>
-      </w:r>
-      <w:proofErr w:type="spellStart"/>
-      <w:r>
         <w:t>predpomni</w:t>
+      </w:r>
+      <w:r>
+        <w:t>k</w:t>
       </w:r>
       <w:proofErr w:type="spellEnd"/>
       <w:r>
@@ -1918,7 +1967,7 @@
       <w:pPr>
         <w:pStyle w:val="Naslov2"/>
       </w:pPr>
-      <w:bookmarkStart w:id="7" w:name="_Toc234349600"/>
+      <w:bookmarkStart w:id="7" w:name="_Toc234433654"/>
       <w:r>
         <w:lastRenderedPageBreak/>
         <w:t>3.3 Grafični vmesnik</w:t>
@@ -2259,10 +2308,10 @@
         <w:t>Počist</w:t>
       </w:r>
       <w:r>
+        <w:t>i</w:t>
+      </w:r>
+      <w:r>
         <w:t>«</w:t>
-      </w:r>
-      <w:r>
-        <w:t>i</w:t>
       </w:r>
       <w:proofErr w:type="spellEnd"/>
       <w:r>
@@ -2509,10 +2558,13 @@
       <w:pPr>
         <w:pStyle w:val="Naslov1"/>
       </w:pPr>
-      <w:bookmarkStart w:id="8" w:name="_Toc234349601"/>
+      <w:bookmarkStart w:id="8" w:name="_Toc234433655"/>
       <w:r>
         <w:lastRenderedPageBreak/>
-        <w:t>4 Rezultati</w:t>
+        <w:t xml:space="preserve">4 </w:t>
+      </w:r>
+      <w:r>
+        <w:t>REZULTATI</w:t>
       </w:r>
       <w:bookmarkEnd w:id="8"/>
     </w:p>
@@ -2540,7 +2592,13 @@
         <w:jc w:val="both"/>
       </w:pPr>
       <w:r>
-        <w:t xml:space="preserve">Pridobila sem jih tako, da sem številke s slik ugank na vajah prepisala v zaslon »Ustvari uganko« in jih izvozila v datoteke </w:t>
+        <w:t xml:space="preserve">Pridobila sem jih tako, da sem številke s slik ugank </w:t>
+      </w:r>
+      <w:r>
+        <w:t>iz</w:t>
+      </w:r>
+      <w:r>
+        <w:t xml:space="preserve"> vaj prepisala v zaslon »Ustvari uganko« in jih izvozila v datoteke </w:t>
       </w:r>
       <w:proofErr w:type="spellStart"/>
       <w:r>
@@ -3894,7 +3952,7 @@
       <w:pPr>
         <w:pStyle w:val="Naslov2"/>
       </w:pPr>
-      <w:bookmarkStart w:id="9" w:name="_Toc234349602"/>
+      <w:bookmarkStart w:id="9" w:name="_Toc234433656"/>
       <w:r>
         <w:lastRenderedPageBreak/>
         <w:t>4.1 Slike rešenih ugank</w:t>
@@ -4588,10 +4646,13 @@
       <w:pPr>
         <w:pStyle w:val="Naslov1"/>
       </w:pPr>
-      <w:bookmarkStart w:id="10" w:name="_Toc234349603"/>
+      <w:bookmarkStart w:id="10" w:name="_Toc234433657"/>
       <w:r>
         <w:lastRenderedPageBreak/>
-        <w:t>5 Zaključek</w:t>
+        <w:t xml:space="preserve">5 </w:t>
+      </w:r>
+      <w:r>
+        <w:t>ZAKLJUČEK</w:t>
       </w:r>
       <w:bookmarkEnd w:id="10"/>
     </w:p>
@@ -4608,7 +4669,16 @@
       </w:r>
       <w:proofErr w:type="spellEnd"/>
       <w:r>
-        <w:t xml:space="preserve">: vseh osem testnih ugank je bilo rešenih pravilno, pri čemer najzahtevnejši primer velikosti 24×14 potrebuje približno 1,6 s, vsi ostali pa bistveno manj. </w:t>
+        <w:t xml:space="preserve"> </w:t>
+      </w:r>
+      <w:r>
+        <w:t>vseh osem testnih ugank je bilo rešenih pravilno, pri čemer najzahtevnejši primer velikosti 24×14 potrebuje približno 1,</w:t>
+      </w:r>
+      <w:r>
+        <w:t>5</w:t>
+      </w:r>
+      <w:r>
+        <w:t xml:space="preserve"> s, vsi ostali pa bistveno manj. </w:t>
       </w:r>
     </w:p>
     <w:p>
@@ -6097,6 +6167,7 @@
   <w:style w:type="character" w:default="1" w:styleId="Privzetapisavaodstavka">
     <w:name w:val="Default Paragraph Font"/>
     <w:uiPriority w:val="1"/>
+    <w:semiHidden/>
     <w:unhideWhenUsed/>
   </w:style>
   <w:style w:type="table" w:default="1" w:styleId="Navadnatabela">

</xml_diff>